<commit_message>
update after day2 PhD
</commit_message>
<xml_diff>
--- a/Wichtigsten Programmiertipps und Hinweise für meine PhD.docx
+++ b/Wichtigsten Programmiertipps und Hinweise für meine PhD.docx
@@ -5148,7 +5148,15 @@
       </w:r>
       <w:proofErr w:type="spellEnd"/>
       <w:r>
-        <w:t xml:space="preserve"> =)) with </w:t>
+        <w:t xml:space="preserve"> =)) </w:t>
+      </w:r>
+      <w:proofErr w:type="spellStart"/>
+      <w:r>
+        <w:t>with</w:t>
+      </w:r>
+      <w:proofErr w:type="spellEnd"/>
+      <w:r>
+        <w:t xml:space="preserve"> </w:t>
       </w:r>
       <w:proofErr w:type="spellStart"/>
       <w:r>
@@ -5278,7 +5286,15 @@
       <w:proofErr w:type="spellEnd"/>
       <w:proofErr w:type="gramEnd"/>
       <w:r>
-        <w:t xml:space="preserve">(n) to see the first n </w:t>
+        <w:t xml:space="preserve">(n) to see the </w:t>
+      </w:r>
+      <w:proofErr w:type="spellStart"/>
+      <w:r>
+        <w:t>first</w:t>
+      </w:r>
+      <w:proofErr w:type="spellEnd"/>
+      <w:r>
+        <w:t xml:space="preserve"> n </w:t>
       </w:r>
       <w:proofErr w:type="spellStart"/>
       <w:r>
@@ -5694,7 +5710,15 @@
       </w:r>
       <w:proofErr w:type="spellEnd"/>
       <w:r>
-        <w:t xml:space="preserve"> file and </w:t>
+        <w:t xml:space="preserve"> </w:t>
+      </w:r>
+      <w:proofErr w:type="spellStart"/>
+      <w:r>
+        <w:t>file</w:t>
+      </w:r>
+      <w:proofErr w:type="spellEnd"/>
+      <w:r>
+        <w:t xml:space="preserve"> and </w:t>
       </w:r>
       <w:proofErr w:type="spellStart"/>
       <w:r>
@@ -5702,11 +5726,19 @@
       </w:r>
       <w:proofErr w:type="spellEnd"/>
       <w:r>
-        <w:t xml:space="preserve"> it to a pandas dat</w:t>
-      </w:r>
-      <w:proofErr w:type="spellStart"/>
-      <w:r>
-        <w:t>a</w:t>
+        <w:t xml:space="preserve"> it to a </w:t>
+      </w:r>
+      <w:proofErr w:type="spellStart"/>
+      <w:r>
+        <w:t>pandas</w:t>
+      </w:r>
+      <w:proofErr w:type="spellEnd"/>
+      <w:r>
+        <w:t xml:space="preserve"> </w:t>
+      </w:r>
+      <w:proofErr w:type="spellStart"/>
+      <w:r>
+        <w:t>data</w:t>
       </w:r>
       <w:proofErr w:type="spellEnd"/>
       <w:r>
@@ -5967,14 +5999,7 @@
           <w:b/>
           <w:bCs/>
         </w:rPr>
-        <w:t xml:space="preserve">: </w:t>
-      </w:r>
-      <w:r>
-        <w:rPr>
-          <w:b/>
-          <w:bCs/>
-        </w:rPr>
-        <w:t>https://www.w3schools.com/bash/bash_ls.php</w:t>
+        <w:t>: https://www.w3schools.com/bash/bash_ls.php</w:t>
       </w:r>
     </w:p>
     <w:p>
@@ -6299,7 +6324,15 @@
       </w:r>
       <w:proofErr w:type="spellEnd"/>
       <w:r>
-        <w:t xml:space="preserve"> back to the directory at a </w:t>
+        <w:t xml:space="preserve"> back to the </w:t>
+      </w:r>
+      <w:proofErr w:type="spellStart"/>
+      <w:r>
+        <w:t>directory</w:t>
+      </w:r>
+      <w:proofErr w:type="spellEnd"/>
+      <w:r>
+        <w:t xml:space="preserve"> at a </w:t>
       </w:r>
       <w:proofErr w:type="spellStart"/>
       <w:r>
@@ -6451,11 +6484,19 @@
       </w:r>
       <w:proofErr w:type="spellEnd"/>
       <w:r>
-        <w:t xml:space="preserve"> remove a new f</w:t>
-      </w:r>
-      <w:proofErr w:type="spellStart"/>
-      <w:r>
-        <w:t>older</w:t>
+        <w:t xml:space="preserve"> remove a </w:t>
+      </w:r>
+      <w:proofErr w:type="spellStart"/>
+      <w:r>
+        <w:t>new</w:t>
+      </w:r>
+      <w:proofErr w:type="spellEnd"/>
+      <w:r>
+        <w:t xml:space="preserve"> </w:t>
+      </w:r>
+      <w:proofErr w:type="spellStart"/>
+      <w:r>
+        <w:t>folder</w:t>
       </w:r>
       <w:proofErr w:type="spellEnd"/>
       <w:r>
@@ -10400,6 +10441,58 @@
         <w:t xml:space="preserve">; </w:t>
       </w:r>
     </w:p>
+    <w:p/>
+    <w:p/>
+    <w:p/>
+    <w:p/>
+    <w:p/>
+    <w:p/>
+    <w:p/>
+    <w:p/>
+    <w:p/>
+    <w:p>
+      <w:pPr>
+        <w:rPr>
+          <w:b/>
+          <w:bCs/>
+        </w:rPr>
+      </w:pPr>
+      <w:proofErr w:type="spellStart"/>
+      <w:r>
+        <w:rPr>
+          <w:b/>
+          <w:bCs/>
+        </w:rPr>
+        <w:lastRenderedPageBreak/>
+        <w:t>Mc</w:t>
+      </w:r>
+      <w:proofErr w:type="spellEnd"/>
+      <w:r>
+        <w:rPr>
+          <w:b/>
+          <w:bCs/>
+        </w:rPr>
+        <w:t xml:space="preserve"> </w:t>
+      </w:r>
+      <w:proofErr w:type="spellStart"/>
+      <w:r>
+        <w:rPr>
+          <w:b/>
+          <w:bCs/>
+        </w:rPr>
+        <w:t>book</w:t>
+      </w:r>
+      <w:proofErr w:type="spellEnd"/>
+      <w:r>
+        <w:rPr>
+          <w:b/>
+          <w:bCs/>
+        </w:rPr>
+        <w:t xml:space="preserve"> und Apple allgemein: </w:t>
+      </w:r>
+    </w:p>
+    <w:p/>
+    <w:p/>
     <w:p/>
     <w:p/>
     <w:sectPr>
@@ -11015,6 +11108,7 @@
   <w:style w:type="character" w:default="1" w:styleId="Absatz-Standardschriftart">
     <w:name w:val="Default Paragraph Font"/>
     <w:uiPriority w:val="1"/>
+    <w:semiHidden/>
     <w:unhideWhenUsed/>
   </w:style>
   <w:style w:type="table" w:default="1" w:styleId="NormaleTabelle">

</xml_diff>